<commit_message>
Thực hiện theo các cập nhật của Backlog_TienTrinh_va_Checklist.md
</commit_message>
<xml_diff>
--- a/DacTaBaiToan/TienTrinh va Checklist.docx
+++ b/DacTaBaiToan/TienTrinh va Checklist.docx
@@ -771,6 +771,179 @@
       <w:pPr>
         <w:jc w:val="left"/>
       </w:pPr>
+      <w:r>
+        <w:t>PHẦN 3 – VIỆC CẬP NHẬT TRẠNG THÁI VÀ CHECKLIST THAY ĐỔI RA SAO.</w:t>
+      </w:r>
+    </w:p>
+    <w:p>
+      <w:pPr>
+        <w:jc w:val="left"/>
+      </w:pPr>
+      <w:r>
+        <w:t>Trường hợp 1: Khi 1 cơ hội mới được khởi tạo và đang ở Trạng thái: CHƯA NẮM BẮT</w:t>
+      </w:r>
+    </w:p>
+    <w:p>
+      <w:pPr>
+        <w:jc w:val="left"/>
+      </w:pPr>
+      <w:r>
+        <w:t>Checklist:</w:t>
+      </w:r>
+    </w:p>
+    <w:p>
+      <w:pPr>
+        <w:pStyle w:val="ListParagraph"/>
+        <w:numPr>
+          <w:ilvl w:val="0"/>
+          <w:numId w:val="5"/>
+        </w:numPr>
+        <w:jc w:val="left"/>
+      </w:pPr>
+      <w:r>
+        <w:t>Sẽ add Trạng thái CHƯA NẮM BẮT vào Checklist</w:t>
+      </w:r>
+    </w:p>
+    <w:p>
+      <w:pPr>
+        <w:pStyle w:val="ListParagraph"/>
+        <w:numPr>
+          <w:ilvl w:val="0"/>
+          <w:numId w:val="5"/>
+        </w:numPr>
+        <w:jc w:val="left"/>
+      </w:pPr>
+      <w:r>
+        <w:t>Add QUY TRÌNH vào</w:t>
+      </w:r>
+    </w:p>
+    <w:p>
+      <w:pPr>
+        <w:jc w:val="left"/>
+      </w:pPr>
+      <w:r>
+        <w:t>Trường hợp 2: Khi thay đổi Trạng thái từ A sang B</w:t>
+      </w:r>
+    </w:p>
+    <w:p>
+      <w:pPr>
+        <w:jc w:val="left"/>
+      </w:pPr>
+      <w:r>
+        <w:t>THÌ TẤT CẢ TIẾN TRÌNH và CÔNG VIỆC của TRẠNG THÁI A đều phải Hoàn Thành, lưu Log rõ ràng do ai thực hiện, thời gian nào, lý do chuyển qua TRẠNG THÁI B</w:t>
+      </w:r>
+    </w:p>
+    <w:p>
+      <w:pPr>
+        <w:pStyle w:val="ListParagraph"/>
+        <w:numPr>
+          <w:ilvl w:val="0"/>
+          <w:numId w:val="5"/>
+        </w:numPr>
+        <w:jc w:val="left"/>
+      </w:pPr>
+      <w:r>
+        <w:t>Các thông tin của TRẠNG THÁI mới được add vào Checklist</w:t>
+      </w:r>
+    </w:p>
+    <w:p>
+      <w:pPr>
+        <w:pStyle w:val="ListParagraph"/>
+        <w:numPr>
+          <w:ilvl w:val="0"/>
+          <w:numId w:val="5"/>
+        </w:numPr>
+        <w:jc w:val="left"/>
+      </w:pPr>
+      <w:r>
+        <w:t>Đối với những Tiến trình nằm trong danh sách khi Chuyển trạng thái mới được add vào Checklist. Ví dụ như đã xóa hết thì ko add vào nữa.</w:t>
+      </w:r>
+    </w:p>
+    <w:p>
+      <w:pPr>
+        <w:jc w:val="left"/>
+      </w:pPr>
+      <w:r>
+        <w:t>Trường hợp 3: Nếu chuyển từ A -&gt; B -&gt; C -&gt; D -&gt; B</w:t>
+      </w:r>
+    </w:p>
+    <w:p>
+      <w:pPr>
+        <w:jc w:val="left"/>
+      </w:pPr>
+      <w:r>
+        <w:t>Thì Trạng thái B lại được add mới vào checklist</w:t>
+      </w:r>
+      <w:r>
+        <w:t>.</w:t>
+      </w:r>
+    </w:p>
+    <w:p>
+      <w:pPr>
+        <w:jc w:val="left"/>
+      </w:pPr>
+    </w:p>
+    <w:p>
+      <w:pPr>
+        <w:jc w:val="left"/>
+      </w:pPr>
+      <w:r>
+        <w:lastRenderedPageBreak/>
+        <w:t>Tất cả thao tác đều phải lưu log lại liên quan đến cập nhật Chuyển trạng thái, cập nhật Tiến trình, ….</w:t>
+      </w:r>
+    </w:p>
+    <w:p>
+      <w:pPr>
+        <w:jc w:val="left"/>
+      </w:pPr>
+      <w:r>
+        <w:t>Để áp dụng xây dựng cây timeline</w:t>
+      </w:r>
+      <w:r>
+        <w:t>.</w:t>
+      </w:r>
+    </w:p>
+    <w:p>
+      <w:pPr>
+        <w:jc w:val="left"/>
+      </w:pPr>
+      <w:r>
+        <w:t>Trường hợp 4: Nếu như xóa hết tiến trình trên checklist thì vẫn giữ Trạng Thái và Quy Trình, chứ ko ẩn đi. Vì người dùng có thể thêm lại danh sách tiến trình mới.</w:t>
+      </w:r>
+    </w:p>
+    <w:p>
+      <w:pPr>
+        <w:jc w:val="left"/>
+      </w:pPr>
+    </w:p>
+    <w:p>
+      <w:pPr>
+        <w:jc w:val="left"/>
+      </w:pPr>
+      <w:r>
+        <w:t>PHẦN 4 – LIÊN QUAN ĐẾN QUẢN LÝ CÔNG VIỆC TRÊN TIẾN TRÌNH</w:t>
+      </w:r>
+    </w:p>
+    <w:p>
+      <w:pPr>
+        <w:jc w:val="left"/>
+      </w:pPr>
+      <w:r>
+        <w:t>Trên mỗi dòng Tiến trình sẽ có 1 nút + Thêm mới công việc.</w:t>
+      </w:r>
+    </w:p>
+    <w:p>
+      <w:pPr>
+        <w:jc w:val="left"/>
+      </w:pPr>
+      <w:r>
+        <w:t>Thông tin công việc giống như tiến trình =&gt; Các hành động tương tự.</w:t>
+      </w:r>
+    </w:p>
+    <w:p>
+      <w:pPr>
+        <w:jc w:val="left"/>
+      </w:pPr>
     </w:p>
     <w:sectPr>
       <w:pgSz w:w="12818" w:h="15840"/>
@@ -1075,6 +1248,118 @@
     </w:lvl>
   </w:abstractNum>
   <w:abstractNum w:abstractNumId="3" w15:restartNumberingAfterBreak="0">
+    <w:nsid w:val="5FA63EFF"/>
+    <w:multiLevelType w:val="hybridMultilevel"/>
+    <w:tmpl w:val="DA86F40E"/>
+    <w:lvl w:ilvl="0" w:tplc="35EAA3A8">
+      <w:numFmt w:val="bullet"/>
+      <w:lvlText w:val="-"/>
+      <w:lvlJc w:val="left"/>
+      <w:pPr>
+        <w:ind w:left="720" w:hanging="360"/>
+      </w:pPr>
+      <w:rPr>
+        <w:rFonts w:ascii="Times New Roman" w:eastAsiaTheme="minorHAnsi" w:hAnsi="Times New Roman" w:cs="Times New Roman" w:hint="default"/>
+      </w:rPr>
+    </w:lvl>
+    <w:lvl w:ilvl="1" w:tplc="04090003" w:tentative="1">
+      <w:start w:val="1"/>
+      <w:numFmt w:val="bullet"/>
+      <w:lvlText w:val="o"/>
+      <w:lvlJc w:val="left"/>
+      <w:pPr>
+        <w:ind w:left="1440" w:hanging="360"/>
+      </w:pPr>
+      <w:rPr>
+        <w:rFonts w:ascii="Courier New" w:hAnsi="Courier New" w:cs="Courier New" w:hint="default"/>
+      </w:rPr>
+    </w:lvl>
+    <w:lvl w:ilvl="2" w:tplc="04090005" w:tentative="1">
+      <w:start w:val="1"/>
+      <w:numFmt w:val="bullet"/>
+      <w:lvlText w:val=""/>
+      <w:lvlJc w:val="left"/>
+      <w:pPr>
+        <w:ind w:left="2160" w:hanging="360"/>
+      </w:pPr>
+      <w:rPr>
+        <w:rFonts w:ascii="Wingdings" w:hAnsi="Wingdings" w:hint="default"/>
+      </w:rPr>
+    </w:lvl>
+    <w:lvl w:ilvl="3" w:tplc="04090001" w:tentative="1">
+      <w:start w:val="1"/>
+      <w:numFmt w:val="bullet"/>
+      <w:lvlText w:val=""/>
+      <w:lvlJc w:val="left"/>
+      <w:pPr>
+        <w:ind w:left="2880" w:hanging="360"/>
+      </w:pPr>
+      <w:rPr>
+        <w:rFonts w:ascii="Symbol" w:hAnsi="Symbol" w:hint="default"/>
+      </w:rPr>
+    </w:lvl>
+    <w:lvl w:ilvl="4" w:tplc="04090003" w:tentative="1">
+      <w:start w:val="1"/>
+      <w:numFmt w:val="bullet"/>
+      <w:lvlText w:val="o"/>
+      <w:lvlJc w:val="left"/>
+      <w:pPr>
+        <w:ind w:left="3600" w:hanging="360"/>
+      </w:pPr>
+      <w:rPr>
+        <w:rFonts w:ascii="Courier New" w:hAnsi="Courier New" w:cs="Courier New" w:hint="default"/>
+      </w:rPr>
+    </w:lvl>
+    <w:lvl w:ilvl="5" w:tplc="04090005" w:tentative="1">
+      <w:start w:val="1"/>
+      <w:numFmt w:val="bullet"/>
+      <w:lvlText w:val=""/>
+      <w:lvlJc w:val="left"/>
+      <w:pPr>
+        <w:ind w:left="4320" w:hanging="360"/>
+      </w:pPr>
+      <w:rPr>
+        <w:rFonts w:ascii="Wingdings" w:hAnsi="Wingdings" w:hint="default"/>
+      </w:rPr>
+    </w:lvl>
+    <w:lvl w:ilvl="6" w:tplc="04090001" w:tentative="1">
+      <w:start w:val="1"/>
+      <w:numFmt w:val="bullet"/>
+      <w:lvlText w:val=""/>
+      <w:lvlJc w:val="left"/>
+      <w:pPr>
+        <w:ind w:left="5040" w:hanging="360"/>
+      </w:pPr>
+      <w:rPr>
+        <w:rFonts w:ascii="Symbol" w:hAnsi="Symbol" w:hint="default"/>
+      </w:rPr>
+    </w:lvl>
+    <w:lvl w:ilvl="7" w:tplc="04090003" w:tentative="1">
+      <w:start w:val="1"/>
+      <w:numFmt w:val="bullet"/>
+      <w:lvlText w:val="o"/>
+      <w:lvlJc w:val="left"/>
+      <w:pPr>
+        <w:ind w:left="5760" w:hanging="360"/>
+      </w:pPr>
+      <w:rPr>
+        <w:rFonts w:ascii="Courier New" w:hAnsi="Courier New" w:cs="Courier New" w:hint="default"/>
+      </w:rPr>
+    </w:lvl>
+    <w:lvl w:ilvl="8" w:tplc="04090005" w:tentative="1">
+      <w:start w:val="1"/>
+      <w:numFmt w:val="bullet"/>
+      <w:lvlText w:val=""/>
+      <w:lvlJc w:val="left"/>
+      <w:pPr>
+        <w:ind w:left="6480" w:hanging="360"/>
+      </w:pPr>
+      <w:rPr>
+        <w:rFonts w:ascii="Wingdings" w:hAnsi="Wingdings" w:hint="default"/>
+      </w:rPr>
+    </w:lvl>
+  </w:abstractNum>
+  <w:abstractNum w:abstractNumId="4" w15:restartNumberingAfterBreak="0">
     <w:nsid w:val="71243ED0"/>
     <w:multiLevelType w:val="hybridMultilevel"/>
     <w:tmpl w:val="7D360CF2"/>
@@ -1190,13 +1475,16 @@
     <w:abstractNumId w:val="1"/>
   </w:num>
   <w:num w:numId="2" w16cid:durableId="623119423">
-    <w:abstractNumId w:val="3"/>
+    <w:abstractNumId w:val="4"/>
   </w:num>
   <w:num w:numId="3" w16cid:durableId="39398587">
     <w:abstractNumId w:val="0"/>
   </w:num>
   <w:num w:numId="4" w16cid:durableId="1236207379">
     <w:abstractNumId w:val="2"/>
+  </w:num>
+  <w:num w:numId="5" w16cid:durableId="131681195">
+    <w:abstractNumId w:val="3"/>
   </w:num>
 </w:numbering>
 </file>

</xml_diff>